<commit_message>
done gen table infuences
</commit_message>
<xml_diff>
--- a/mode_docx_nc/pmi_dzt/template.docx
+++ b/mode_docx_nc/pmi_dzt/template.docx
@@ -4674,7 +4674,7 @@
       <w:bookmarkStart w:id="8" w:name="_Toc197437223"/>
       <w:r>
         <w:lastRenderedPageBreak/>
-        <w:t>ПРОГРАММА И МЕТОДИКИ ПРОВЕДЕНИЯ ИСПЫТАНИЙ</w:t>
+        <w:t>ПРОГРАММА ПРОВЕДЕНИЯ ИСПЫТАНИЙ</w:t>
       </w:r>
       <w:bookmarkEnd w:id="8"/>
     </w:p>
@@ -4693,7 +4693,12 @@
         <w:pStyle w:val="3"/>
       </w:pPr>
       <w:r>
-        <w:t xml:space="preserve">  Оценка корректности реализации логических взаимосвязей между функциональными блоками (</w:t>
+        <w:t xml:space="preserve">  Оценка корректности реализации лог</w:t>
+      </w:r>
+      <w:bookmarkStart w:id="10" w:name="_GoBack"/>
+      <w:bookmarkEnd w:id="10"/>
+      <w:r>
+        <w:t>ических взаимосвязей между функциональными блоками (</w:t>
       </w:r>
       <w:r>
         <w:t>ДЗТ</w:t>
@@ -4718,11 +4723,11 @@
       <w:pPr>
         <w:pStyle w:val="2"/>
       </w:pPr>
-      <w:bookmarkStart w:id="10" w:name="_Toc197437225"/>
+      <w:bookmarkStart w:id="11" w:name="_Toc197437225"/>
       <w:r>
         <w:t>Подключение аналоговых цепей к устройству</w:t>
       </w:r>
-      <w:bookmarkEnd w:id="10"/>
+      <w:bookmarkEnd w:id="11"/>
     </w:p>
     <w:p>
       <w:pPr>
@@ -4800,10 +4805,10 @@
             <v:path o:extrusionok="f" gradientshapeok="t" o:connecttype="rect"/>
             <o:lock v:ext="edit" aspectratio="t"/>
           </v:shapetype>
-          <v:shape id="_x0000_i1025" type="#_x0000_t75" style="width:199.85pt;height:200.45pt" o:ole="">
+          <v:shape id="_x0000_i1025" type="#_x0000_t75" style="width:199.65pt;height:200.55pt" o:ole="">
             <v:imagedata r:id="rId10" o:title=""/>
           </v:shape>
-          <o:OLEObject Type="Embed" ProgID="Acrobat.Document.DC" ShapeID="_x0000_i1025" DrawAspect="Content" ObjectID="_1809150280" r:id="rId11"/>
+          <o:OLEObject Type="Embed" ProgID="Acrobat.Document.DC" ShapeID="_x0000_i1025" DrawAspect="Content" ObjectID="_1813738442" r:id="rId11"/>
         </w:object>
       </w:r>
     </w:p>
@@ -4819,11 +4824,11 @@
       <w:pPr>
         <w:pStyle w:val="2"/>
       </w:pPr>
-      <w:bookmarkStart w:id="11" w:name="_Toc197437226"/>
+      <w:bookmarkStart w:id="12" w:name="_Toc197437226"/>
       <w:r>
         <w:t>Подключение дискретных входных и выходных цепей устройства</w:t>
       </w:r>
-      <w:bookmarkEnd w:id="11"/>
+      <w:bookmarkEnd w:id="12"/>
     </w:p>
     <w:p>
       <w:pPr>
@@ -4842,10 +4847,10 @@
       </w:pPr>
       <w:r>
         <w:object w:dxaOrig="19650" w:dyaOrig="13425">
-          <v:shape id="_x0000_i1026" type="#_x0000_t75" style="width:411.85pt;height:283.4pt" o:ole="">
+          <v:shape id="_x0000_i1026" type="#_x0000_t75" style="width:411.9pt;height:283.3pt" o:ole="">
             <v:imagedata r:id="rId12" o:title=""/>
           </v:shape>
-          <o:OLEObject Type="Embed" ProgID="Acrobat.Document.DC" ShapeID="_x0000_i1026" DrawAspect="Content" ObjectID="_1809150281" r:id="rId13"/>
+          <o:OLEObject Type="Embed" ProgID="Acrobat.Document.DC" ShapeID="_x0000_i1026" DrawAspect="Content" ObjectID="_1813738443" r:id="rId13"/>
         </w:object>
       </w:r>
     </w:p>
@@ -4861,14 +4866,14 @@
       <w:pPr>
         <w:pStyle w:val="2"/>
       </w:pPr>
-      <w:bookmarkStart w:id="12" w:name="_Toc197437227"/>
+      <w:bookmarkStart w:id="13" w:name="_Toc197437227"/>
       <w:r>
         <w:t>Назначение дискрет</w:t>
       </w:r>
       <w:r>
         <w:t>ных входов устройства ЮНИТ-М300</w:t>
       </w:r>
-      <w:bookmarkEnd w:id="12"/>
+      <w:bookmarkEnd w:id="13"/>
       <w:r>
         <w:t xml:space="preserve">  </w:t>
       </w:r>
@@ -7590,7 +7595,7 @@
       <w:pPr>
         <w:pStyle w:val="a"/>
       </w:pPr>
-      <w:bookmarkStart w:id="13" w:name="_Ref191625992"/>
+      <w:bookmarkStart w:id="14" w:name="_Ref191625992"/>
       <w:r>
         <w:t xml:space="preserve">Назначение дискретных входов ЮНИТ-М300 для проверки </w:t>
       </w:r>
@@ -9331,7 +9336,7 @@
       <w:r>
         <w:t xml:space="preserve">ЮНИТ-М300 для проверки </w:t>
       </w:r>
-      <w:bookmarkEnd w:id="13"/>
+      <w:bookmarkEnd w:id="14"/>
       <w:r>
         <w:t>ДТЗт. Часть 2</w:t>
       </w:r>
@@ -11090,7 +11095,7 @@
       <w:pPr>
         <w:pStyle w:val="2"/>
       </w:pPr>
-      <w:bookmarkStart w:id="14" w:name="_Toc197437228"/>
+      <w:bookmarkStart w:id="15" w:name="_Toc197437228"/>
       <w:r>
         <w:lastRenderedPageBreak/>
         <w:t>Назначение вы</w:t>
@@ -11098,7 +11103,7 @@
       <w:r>
         <w:t>ходных реле устройств ЮНИТ-М300</w:t>
       </w:r>
-      <w:bookmarkEnd w:id="14"/>
+      <w:bookmarkEnd w:id="15"/>
       <w:r>
         <w:t xml:space="preserve">  </w:t>
       </w:r>
@@ -12442,11 +12447,11 @@
       <w:pPr>
         <w:pStyle w:val="a"/>
       </w:pPr>
-      <w:bookmarkStart w:id="15" w:name="_Ref191631805"/>
+      <w:bookmarkStart w:id="16" w:name="_Ref191631805"/>
       <w:r>
         <w:t xml:space="preserve">Выходные реле устройства ЮНИТ-М300 для проверки </w:t>
       </w:r>
-      <w:bookmarkEnd w:id="15"/>
+      <w:bookmarkEnd w:id="16"/>
       <w:r>
         <w:t>КЦТст1</w:t>
       </w:r>
@@ -20217,8 +20222,6 @@
         </w:numPr>
         <w:ind w:left="709"/>
       </w:pPr>
-      <w:bookmarkStart w:id="16" w:name="_GoBack"/>
-      <w:bookmarkEnd w:id="16"/>
     </w:p>
     <w:sectPr>
       <w:headerReference w:type="default" r:id="rId14"/>
@@ -20664,14 +20667,27 @@
           <w:r>
             <w:t>/</w:t>
           </w:r>
-          <w:fldSimple w:instr=" NUMPAGES   \* MERGEFORMAT ">
-            <w:r>
-              <w:rPr>
-                <w:noProof/>
-              </w:rPr>
-              <w:t>12</w:t>
-            </w:r>
-          </w:fldSimple>
+          <w:r>
+            <w:fldChar w:fldCharType="begin"/>
+          </w:r>
+          <w:r>
+            <w:instrText xml:space="preserve"> NUMPAGES   \* MERGEFORMAT </w:instrText>
+          </w:r>
+          <w:r>
+            <w:fldChar w:fldCharType="separate"/>
+          </w:r>
+          <w:r>
+            <w:rPr>
+              <w:noProof/>
+            </w:rPr>
+            <w:t>12</w:t>
+          </w:r>
+          <w:r>
+            <w:rPr>
+              <w:noProof/>
+            </w:rPr>
+            <w:fldChar w:fldCharType="end"/>
+          </w:r>
         </w:p>
       </w:tc>
     </w:tr>
@@ -20756,27 +20772,14 @@
           <w:r>
             <w:t xml:space="preserve"> из </w:t>
           </w:r>
-          <w:r>
-            <w:fldChar w:fldCharType="begin"/>
-          </w:r>
-          <w:r>
-            <w:instrText xml:space="preserve"> NUMPAGES </w:instrText>
-          </w:r>
-          <w:r>
-            <w:fldChar w:fldCharType="separate"/>
-          </w:r>
-          <w:r>
-            <w:rPr>
-              <w:noProof/>
-            </w:rPr>
-            <w:t>12</w:t>
-          </w:r>
-          <w:r>
-            <w:rPr>
-              <w:noProof/>
-            </w:rPr>
-            <w:fldChar w:fldCharType="end"/>
-          </w:r>
+          <w:fldSimple w:instr=" NUMPAGES ">
+            <w:r>
+              <w:rPr>
+                <w:noProof/>
+              </w:rPr>
+              <w:t>12</w:t>
+            </w:r>
+          </w:fldSimple>
           <w:r>
             <w:t xml:space="preserve"> </w:t>
           </w:r>
@@ -22904,7 +22907,7 @@
 </file>
 
 <file path=customXml/itemProps1.xml><?xml version="1.0" encoding="utf-8"?>
-<ds:datastoreItem xmlns:ds="http://schemas.openxmlformats.org/officeDocument/2006/customXml" ds:itemID="{F02FFB86-66A0-463A-9EC2-F3D8ABB600A9}">
+<ds:datastoreItem xmlns:ds="http://schemas.openxmlformats.org/officeDocument/2006/customXml" ds:itemID="{E7CBAFA0-3334-4A9A-B514-5728C61A69C2}">
   <ds:schemaRefs>
     <ds:schemaRef ds:uri="http://schemas.openxmlformats.org/officeDocument/2006/bibliography"/>
   </ds:schemaRefs>

</xml_diff>